<commit_message>
submission for perliminary project report
update readme
</commit_message>
<xml_diff>
--- a/Richmond_Preliminary_Report_Draft.docx
+++ b/Richmond_Preliminary_Report_Draft.docx
@@ -90,7 +90,7 @@
     <w:p>
       <w:pPr/>
       <w:r>
-        <w:t>For the chain builds (distortion + tremolo + delay in one IP), the C simulations pass all four test cases for both Build 1 and Build 2. Neither build has been synthesized or deployed to hardware yet. That is the main work remaining.</w:t>
+        <w:t>For the chain builds (distortion + tremolo + delay in one IP), the C simulations pass all four test cases for both Build 1 and Build 2. Build 1 has been synthesized -- results are in the Design Space Exploration section below. Build 2 synthesis and hardware deployment for both builds are the main remaining items.</w:t>
       </w:r>
     </w:p>
     <w:p>
@@ -104,7 +104,7 @@
     <w:p>
       <w:pPr/>
       <w:r>
-        <w:t>Build 1 runs three back-to-back pipelined loops. The distortion and tremolo loops both achieve II=1 (one sample per clock cycle). The delay loop comes out at II=2 because of BRAM read latency -- the loop reads then writes the same buffer in the same iteration, and BRAM takes one extra cycle to return a read result. Estimated total latency is around 1920 cycles for one 480-sample chunk at 100 MHz, which is about 19 microseconds.</w:t>
+        <w:t>Build 1 runs three back-to-back pipelined loops. All three loops achieved II=1, including the delay loop -- this was better than expected. The delay loop does have a longer pipeline (4-cycle iteration latency vs. 3 for distortion and tremolo) because of BRAM read latency, but the DEPENDENCE pragma was enough to keep II at 1. Measured synthesis results from Vitis HLS 2024.1 on xczu3eg-sfvc784-2-e at 100 MHz: total latency 1469 cycles (14.69 us) for one 480-sample chunk, well within the 10 ms real-time budget. Resource utilization: 19 BRAM (4%), 12 DSP (3%), 3249 LUT (4%), 2246 FF (1%). Timing slack at the top level is 0.00 ns, meaning the design is right at the 100 MHz limit in HLS estimates -- worth watching during Vivado implementation.</w:t>
       </w:r>
     </w:p>
     <w:p>
@@ -116,7 +116,7 @@
     <w:p>
       <w:pPr/>
       <w:r>
-        <w:t>There is a complication. Both do_tremolo and do_delay use static local variables -- the LFO phase counter and the delay circular buffer need to persist between 10 ms chunks or the audio would restart every call. Static variables in DATAFLOW sub-functions violate the canonical form rules, which means HLS will warn and may schedule the stages more conservatively than the ideal overlap. The actual latency reduction after synthesis may be smaller than predicted. I will not know until synthesis runs, which is next on the list.</w:t>
+        <w:t>There is a complication. Both do_tremolo and do_delay use static local variables -- the LFO phase counter and the delay circular buffer need to persist between 10 ms chunks or the audio would restart every call. Static variables in DATAFLOW sub-functions violate the canonical form rules, which means HLS will warn and may schedule the stages more conservatively than the ideal overlap. The actual latency reduction after synthesis may be smaller than the theoretical ~960 cycles. Build 2 synthesis is next.</w:t>
       </w:r>
     </w:p>
     <w:p/>
@@ -152,7 +152,7 @@
     <w:p>
       <w:pPr/>
       <w:r>
-        <w:t>The AXI interface setup was the hardest part. The distortion IP exports two separate AXI-Lite buses and PYNQ only wraps one of them automatically. I spent a while chasing a timeout because the buffer address registers were being written to the wrong interface. The fix was to open the .hwh file as text and match register names to address offsets, which I should have done first.</w:t>
+        <w:t>The AXI interface setup was the hardest part and came up twice. First: the distortion IP exports two separate AXI-Lite buses and PYNQ only wraps one automatically. I spent time chasing a timeout because the buffer address registers were being written to the wrong interface -- fixed by opening the .hwh as text and matching register names to address offsets. Second, and more fundamental: when building the Vivado block design for chain_top, the m_axi_MEM port (the IP's AXI master for reading/writing audio samples in DDR) was not connected. The block design had the AXI-Lite control path wired correctly but the data path was missing entirely. The fix was to enable S_AXI_HP0_FPD on the Zynq PS block (PS-PL Configuration &gt; HP Slave AXI Interface), add an AXI SmartConnect, and wire m_axi_MEM through it to the HP port. Without this the IP starts, issues AXI read bursts, gets no response, and AP_DONE never asserts -- same silent timeout as the wrong-interface bug but a different root cause.</w:t>
       </w:r>
     </w:p>
     <w:p>
@@ -178,7 +178,7 @@
     <w:p>
       <w:pPr/>
       <w:r>
-        <w:t>The immediate priority is synthesizing both chain builds, building the Vivado block design for chain_top, generating a bitstream, and deploying it. Without real synthesis numbers the Build 1 vs Build 2 comparison is speculation. Once hardware results are in, the final report will have an actual latency and BRAM comparison, which is the main deliverable of the project.</w:t>
+        <w:t>Build 1 synthesis is done (1469 cycles, 19 BRAM, all loops II=1). The Vivado block design for chain_top is in progress -- the m_axi_MEM connection issue has been identified and the fix is known (HP0 + SmartConnect). Next steps are finishing the block design, running implementation, generating a bitstream, and deploying to the board. Build 2 synthesis is also still to do. Once both are synthesized and at least Build 1 is running on hardware, there will be real latency and BRAM numbers for the comparison -- that is the main deliverable.</w:t>
       </w:r>
     </w:p>
     <w:p>

</xml_diff>

<commit_message>
refactoring to make this much more clear to run
i've made quite the mess here, cleaning this up in order to give y'all an easier time, running and understanding this project. refer to README and the preliminary project report draft for guidence..
</commit_message>
<xml_diff>
--- a/Richmond_Preliminary_Report_Draft.docx
+++ b/Richmond_Preliminary_Report_Draft.docx
@@ -66,6 +66,52 @@
       </w:r>
     </w:p>
     <w:p>
+      <w:pPr/>
+      <w:r>
+        <w:drawing>
+          <wp:inline xmlns:a="http://schemas.openxmlformats.org/drawingml/2006/main" xmlns:pic="http://schemas.openxmlformats.org/drawingml/2006/picture">
+            <wp:extent cx="4389120" cy="4089144"/>
+            <wp:docPr id="1" name="Picture 1"/>
+            <wp:cNvGraphicFramePr>
+              <a:graphicFrameLocks noChangeAspect="1"/>
+            </wp:cNvGraphicFramePr>
+            <a:graphic>
+              <a:graphicData uri="http://schemas.openxmlformats.org/drawingml/2006/picture">
+                <pic:pic>
+                  <pic:nvPicPr>
+                    <pic:cNvPr id="0" name="block_diagram.png"/>
+                    <pic:cNvPicPr/>
+                  </pic:nvPicPr>
+                  <pic:blipFill>
+                    <a:blip r:embed="rId9"/>
+                    <a:stretch>
+                      <a:fillRect/>
+                    </a:stretch>
+                  </pic:blipFill>
+                  <pic:spPr>
+                    <a:xfrm>
+                      <a:off x="0" y="0"/>
+                      <a:ext cx="4389120" cy="4089144"/>
+                    </a:xfrm>
+                    <a:prstGeom prst="rect"/>
+                  </pic:spPr>
+                </pic:pic>
+              </a:graphicData>
+            </a:graphic>
+          </wp:inline>
+        </w:drawing>
+      </w:r>
+    </w:p>
+    <w:p>
+      <w:pPr/>
+      <w:r>
+        <w:rPr>
+          <w:i/>
+        </w:rPr>
+        <w:t>Figure 1: Vivado block design for chain_top. m_axi_MEM connects through an AXI SmartConnect to S_AXI_HP0_FPD on the Zynq PS, giving the HLS IP a direct DMA path to DDR.</w:t>
+      </w:r>
+    </w:p>
+    <w:p>
       <w:pPr>
         <w:pStyle w:val="Heading1"/>
       </w:pPr>
@@ -82,9 +128,7 @@
     <w:p/>
     <w:p>
       <w:pPr/>
-      <w:r>
-        <w:t>[Figure 1: distortion_fpga_vs_python.png -- insert here]</w:t>
-      </w:r>
+      <w:r/>
     </w:p>
     <w:p/>
     <w:p>
@@ -110,6 +154,52 @@
     <w:p>
       <w:pPr/>
       <w:r>
+        <w:drawing>
+          <wp:inline xmlns:a="http://schemas.openxmlformats.org/drawingml/2006/main" xmlns:pic="http://schemas.openxmlformats.org/drawingml/2006/picture">
+            <wp:extent cx="4389120" cy="3585367"/>
+            <wp:docPr id="3" name="Picture 3"/>
+            <wp:cNvGraphicFramePr>
+              <a:graphicFrameLocks noChangeAspect="1"/>
+            </wp:cNvGraphicFramePr>
+            <a:graphic>
+              <a:graphicData uri="http://schemas.openxmlformats.org/drawingml/2006/picture">
+                <pic:pic>
+                  <pic:nvPicPr>
+                    <pic:cNvPr id="0" name="seems like i got plenty of space!.png"/>
+                    <pic:cNvPicPr/>
+                  </pic:nvPicPr>
+                  <pic:blipFill>
+                    <a:blip r:embed="rId11"/>
+                    <a:stretch>
+                      <a:fillRect/>
+                    </a:stretch>
+                  </pic:blipFill>
+                  <pic:spPr>
+                    <a:xfrm>
+                      <a:off x="0" y="0"/>
+                      <a:ext cx="4389120" cy="3585367"/>
+                    </a:xfrm>
+                    <a:prstGeom prst="rect"/>
+                  </pic:spPr>
+                </pic:pic>
+              </a:graphicData>
+            </a:graphic>
+          </wp:inline>
+        </w:drawing>
+      </w:r>
+    </w:p>
+    <w:p>
+      <w:pPr/>
+      <w:r>
+        <w:rPr>
+          <w:i/>
+        </w:rPr>
+        <w:t>Figure 3: Vivado device view after implementation. The design is extremely sparse on the xczu3eg -- well within resource budget.</w:t>
+      </w:r>
+    </w:p>
+    <w:p>
+      <w:pPr/>
+      <w:r>
         <w:t>Build 2 puts the same math inside three sub-functions (do_distortion, do_tremolo, do_delay) and applies DATAFLOW to the top function. In theory, HLS schedules these as overlapping pipeline stages connected by ping-pong BRAMs, so that tremolo can start chunk N while distortion is already on chunk N+1. That should drop the latency to roughly the longest single stage, about 960 cycles. Build 2 was refactored from Build 1 with help from Claude -- the architecture decision and the math are mine, but I had Claude do the mechanical work of wrapping the loops in sub-functions.</w:t>
       </w:r>
     </w:p>
@@ -123,7 +213,47 @@
     <w:p>
       <w:pPr/>
       <w:r>
-        <w:t>[Figure 2: chain_fpga_vs_python.png -- insert after chain build is deployed]</w:t>
+        <w:drawing>
+          <wp:inline xmlns:a="http://schemas.openxmlformats.org/drawingml/2006/main" xmlns:pic="http://schemas.openxmlformats.org/drawingml/2006/picture">
+            <wp:extent cx="4754880" cy="2832329"/>
+            <wp:docPr id="2" name="Picture 2"/>
+            <wp:cNvGraphicFramePr>
+              <a:graphicFrameLocks noChangeAspect="1"/>
+            </wp:cNvGraphicFramePr>
+            <a:graphic>
+              <a:graphicData uri="http://schemas.openxmlformats.org/drawingml/2006/picture">
+                <pic:pic>
+                  <pic:nvPicPr>
+                    <pic:cNvPr id="0" name="WORKING ON PYNQ!!!.png"/>
+                    <pic:cNvPicPr/>
+                  </pic:nvPicPr>
+                  <pic:blipFill>
+                    <a:blip r:embed="rId10"/>
+                    <a:stretch>
+                      <a:fillRect/>
+                    </a:stretch>
+                  </pic:blipFill>
+                  <pic:spPr>
+                    <a:xfrm>
+                      <a:off x="0" y="0"/>
+                      <a:ext cx="4754880" cy="2832329"/>
+                    </a:xfrm>
+                    <a:prstGeom prst="rect"/>
+                  </pic:spPr>
+                </pic:pic>
+              </a:graphicData>
+            </a:graphic>
+          </wp:inline>
+        </w:drawing>
+      </w:r>
+    </w:p>
+    <w:p>
+      <w:pPr/>
+      <w:r>
+        <w:rPr>
+          <w:i/>
+        </w:rPr>
+        <w:t>Figure 2: chain_top running on the AUP-ZU3. Output from pynq_test_chain.py -- dry input, FPGA output, and Python reference overlaid. FPGA and reference are bit-exact.</w:t>
       </w:r>
     </w:p>
     <w:p/>

</xml_diff>